<commit_message>
feat: plumes IA — veto anti-6 sur le Nevermore Die Roll (2 plumes: 6->5 sauve le cadran + vole 1 CP ; 1 plume: relance). Première dépense de plumes par l'IA (ressource dormante, pattern GP). Guide rv §4 réécrit: les plumes n'agissent QUE sur le dé Nevermore (jeton vérifié — mon « câblage manquant » était faux, l'UI était déjà complète)
Co-Authored-By: Claude Fable 5 <noreply@anthropic.com>
Claude-Session: https://claude.ai/code/session_01Fos6ri5iVUs1Z7HuNKf1D1
</commit_message>
<xml_diff>
--- a/Guide_Raveness.docx
+++ b/Guide_Raveness.docx
@@ -377,7 +377,15 @@
         <w:pStyle w:val="ListBullet"/>
       </w:pPr>
       <w:r>
-        <w:t>La valeur affichée de Fowl Friend suppose que les plumes servent. Aujourd'hui, dans l'interface, tu ne peux les dépenser que sur le dé Nevermore — pas pour relancer ou ajuster tes dés d'attaque (le câblage est en cours). D'ici là, mentalement, retire 1 à 2 points à Fowl Friend et privilégie Murder of Crows sur la même paire d'Ailes.</w:t>
+        <w:t>Les plumes n'agissent QUE sur le Nevermore Die Roll (jeton vérifié) — jamais sur tes dés d'attaque. Leur doctrine : garde 2 plumes en banque pour opposer ton veto à la face 6 (la seule mauvaise : cadran effacé, retour sans soin) en la décalant en 5 — tu sauves ton cadran ET tu voles 1 CP. Une plume seule = relance du 6, le veto du pauvre. Deux plumes décalent aussi un 3 en 2 (double activation). Trois plumes = activation directe, la soupape quand tu plafonnes à 5.</w:t>
+      </w:r>
+    </w:p>
+    <w:p>
+      <w:pPr>
+        <w:pStyle w:val="ListBullet"/>
+      </w:pPr>
+      <w:r>
+        <w:t>Chaque upkeep adverse devient une loterie à six faces dont CINQ te sont favorables — et les plumes te laissent contrôler le tirage. C'est pour financer ce contrôle que Fowl Friend existe.</w:t>
       </w:r>
     </w:p>
     <w:p>

</xml_diff>